<commit_message>
Renumber labs: new Lab 7 (HAND flooding), Avalanche 8, Butte 9, Interpolation 10, Lab 12 Network
The three water labs now run in sequence (watersheds, bathymetry, flooding).
Folders, image and data-zip names (zips repacked with renamed top folder and
geodatabase), report templates and generator keys, tools/labNN, and lab and
deck text shifted 7->8, 8->9, 9->10. The Wind Farm lab is retired to
docs/assignments/windfarm-backup (plan in tools/windfarm). Placeholder pages
for Lab 7 and Lab 12. Calendar: Lab 7 due Week 9, then one lab a week, Lab 12
due Week 14. Historical notes that refer to Word-era numbers, C:\Ames paths,
and the alt text of six captures that still show the old geodatabase names
were left as they are. Deck placement for the new calendar is pending review.

Co-Authored-By: Claude Opus 5.5 <noreply@anthropic.com>
</commit_message>
<xml_diff>
--- a/docs/assignments/lab-08/lab08-report-template.docx
+++ b/docs/assignments/lab-08/lab08-report-template.docx
@@ -170,7 +170,7 @@
           <w:sz w:val="48"/>
           <w:szCs w:val="48"/>
         </w:rPr>
-        <w:t xml:space="preserve">Lab 8: Big Southern Butte</w:t>
+        <w:t xml:space="preserve">Lab 8: Avalanche Hazard</w:t>
       </w:r>
     </w:p>
     <w:p>
@@ -184,7 +184,7 @@
           <w:sz w:val="32"/>
           <w:szCs w:val="32"/>
         </w:rPr>
-        <w:t xml:space="preserve">Measuring the volume of a volcanic dome by rebuilding the plain beneath it</w:t>
+        <w:t xml:space="preserve">Terrain-based avalanche hazard screening from slope, aspect, and elevation</w:t>
       </w:r>
     </w:p>
     <w:p>
@@ -361,7 +361,7 @@
           <w:sz w:val="19"/>
           <w:szCs w:val="19"/>
         </w:rPr>
-        <w:t xml:space="preserve">Rubric: the requirements of the project and your approach to solving it, in your own words (2 points). Two or three paragraphs. Say what you set out to measure and how you went about it — not a retelling of the step-by-step. If you built the model without the step-by-step instructions, say so here.</w:t>
+        <w:t xml:space="preserve">Rubric: the requirements of the project and your approach to solving it, in your own words (2 points). Two or three paragraphs. Say what you set out to show and how you went about it — not a retelling of the step-by-step. If you built the model without the step-by-step instructions, say so here.</w:t>
       </w:r>
     </w:p>
     <w:p>
@@ -406,7 +406,7 @@
           <w:sz w:val="19"/>
           <w:szCs w:val="19"/>
         </w:rPr>
-        <w:t xml:space="preserve">Rubric: the three metadata values for the DEM and what each means for your result (2 points). Confirm them yourself from READ-ME-FIRST.txt, the raster’s properties and the two tiles’ metadata files — do not copy them from Figure A.</w:t>
+        <w:t xml:space="preserve">Rubric: the three metadata values for the DEM and what each means for your result (2 points). Confirm them yourself from READ-ME-FIRST.txt, the raster’s properties and the tile’s metadata file — do not copy them from Figure A.</w:t>
       </w:r>
     </w:p>
     <w:p>
@@ -1064,7 +1064,7 @@
                 <w:sz w:val="19"/>
                 <w:szCs w:val="19"/>
               </w:rPr>
-              <w:t xml:space="preserve">Buffer</w:t>
+              <w:t xml:space="preserve">Slope</w:t>
             </w:r>
           </w:p>
         </w:tc>
@@ -1178,7 +1178,7 @@
                 <w:sz w:val="19"/>
                 <w:szCs w:val="19"/>
               </w:rPr>
-              <w:t xml:space="preserve">Create Random Points</w:t>
+              <w:t xml:space="preserve">Aspect</w:t>
             </w:r>
           </w:p>
         </w:tc>
@@ -1289,7 +1289,7 @@
                 <w:sz w:val="19"/>
                 <w:szCs w:val="19"/>
               </w:rPr>
-              <w:t xml:space="preserve">Extract Values to Points</w:t>
+              <w:t xml:space="preserve">Reclassify (slope)</w:t>
             </w:r>
           </w:p>
         </w:tc>
@@ -1403,7 +1403,7 @@
                 <w:sz w:val="19"/>
                 <w:szCs w:val="19"/>
               </w:rPr>
-              <w:t xml:space="preserve">Erase</w:t>
+              <w:t xml:space="preserve">Reclassify (aspect)</w:t>
             </w:r>
           </w:p>
         </w:tc>
@@ -1514,7 +1514,7 @@
                 <w:sz w:val="19"/>
                 <w:szCs w:val="19"/>
               </w:rPr>
-              <w:t xml:space="preserve">IDW</w:t>
+              <w:t xml:space="preserve">Raster Calculator (altitude, with Shift)</w:t>
             </w:r>
           </w:p>
         </w:tc>
@@ -1628,7 +1628,7 @@
                 <w:sz w:val="19"/>
                 <w:szCs w:val="19"/>
               </w:rPr>
-              <w:t xml:space="preserve">Extract by Mask (DEM)</w:t>
+              <w:t xml:space="preserve">Raster Calculator (all three agree)</w:t>
             </w:r>
           </w:p>
         </w:tc>
@@ -1739,7 +1739,7 @@
                 <w:sz w:val="19"/>
                 <w:szCs w:val="19"/>
               </w:rPr>
-              <w:t xml:space="preserve">Extract by Mask (plain)</w:t>
+              <w:t xml:space="preserve">Raster Calculator (geometric mean)</w:t>
             </w:r>
           </w:p>
         </w:tc>
@@ -1853,7 +1853,7 @@
                 <w:sz w:val="19"/>
                 <w:szCs w:val="19"/>
               </w:rPr>
-              <w:t xml:space="preserve">Raster Calculator (height)</w:t>
+              <w:t xml:space="preserve">Cell Statistics (maximum)</w:t>
             </w:r>
           </w:p>
         </w:tc>
@@ -1964,7 +1964,7 @@
                 <w:sz w:val="19"/>
                 <w:szCs w:val="19"/>
               </w:rPr>
-              <w:t xml:space="preserve">Raster Calculator (volume)</w:t>
+              <w:t xml:space="preserve">Cell Statistics (minimum)</w:t>
             </w:r>
           </w:p>
         </w:tc>
@@ -2078,7 +2078,7 @@
                 <w:sz w:val="19"/>
                 <w:szCs w:val="19"/>
               </w:rPr>
-              <w:t xml:space="preserve">Zonal Statistics</w:t>
+              <w:t xml:space="preserve">Raster Calculator (rule spread)</w:t>
             </w:r>
           </w:p>
         </w:tc>
@@ -2292,7 +2292,7 @@
           <w:sz w:val="19"/>
           <w:szCs w:val="19"/>
         </w:rPr>
-        <w:t xml:space="preserve">Rubric: a screen capture of the tool dialog with the outline and the number of points exposed as parameters (2 points).</w:t>
+        <w:t xml:space="preserve">Rubric: a screen capture of the toolbox interface with the shift parameter exposed (2 points).</w:t>
       </w:r>
     </w:p>
     <w:tbl>
@@ -2353,7 +2353,7 @@
           <w:sz w:val="19"/>
           <w:szCs w:val="19"/>
         </w:rPr>
-        <w:t xml:space="preserve">Figure 2. The model’s tool dialog, with the outline and the number of points exposed.</w:t>
+        <w:t xml:space="preserve">Figure 2. The model’s tool dialog, with the Shift parameter exposed.</w:t>
       </w:r>
     </w:p>
     <w:p>
@@ -2369,7 +2369,7 @@
           <w:sz w:val="28"/>
           <w:szCs w:val="28"/>
         </w:rPr>
-        <w:t xml:space="preserve">4.  Check Values</w:t>
+        <w:t xml:space="preserve">4.  Snowbird by Hazard Class</w:t>
       </w:r>
     </w:p>
     <w:p>
@@ -2384,7 +2384,7 @@
           <w:sz w:val="19"/>
           <w:szCs w:val="19"/>
         </w:rPr>
-        <w:t xml:space="preserve">Rubric: your check values from Steps 4 to 8 (2 points), and the model’s baseline volume matching the check value (part of the 4 points for a working model). Use the random seed of Step 0.</w:t>
+        <w:t xml:space="preserve">Rubric: the model runs end to end from its tool dialog and its Step 8 table of Snowbird’s areas at shift 0 matches the check values (part of the 4 points for a working model). Tabulate Area reports square meters; divide by 1,000,000.</w:t>
       </w:r>
     </w:p>
     <w:p>
@@ -2414,10 +2414,12 @@
         </w:tblBorders>
       </w:tblPr>
       <w:tblGrid>
-        <w:gridCol w:w="2340"/>
-        <w:gridCol w:w="2340"/>
-        <w:gridCol w:w="2340"/>
-        <w:gridCol w:w="2340"/>
+        <w:gridCol w:w="1560"/>
+        <w:gridCol w:w="1560"/>
+        <w:gridCol w:w="1560"/>
+        <w:gridCol w:w="1560"/>
+        <w:gridCol w:w="1560"/>
+        <w:gridCol w:w="1560"/>
       </w:tblGrid>
       <w:tr>
         <w:trPr>
@@ -2426,7 +2428,7 @@
         </w:trPr>
         <w:tc>
           <w:tcPr>
-            <w:tcW w:type="dxa" w:w="2340"/>
+            <w:tcW w:type="dxa" w:w="1560"/>
             <w:shd w:fill="D9E2F3" w:color="auto" w:val="clear"/>
             <w:tcMar>
               <w:top w:type="dxa" w:w="90"/>
@@ -2444,13 +2446,13 @@
                 <w:sz w:val="19"/>
                 <w:szCs w:val="19"/>
               </w:rPr>
-              <w:t xml:space="preserve">Points kept after Erase</w:t>
-            </w:r>
-          </w:p>
-        </w:tc>
-        <w:tc>
-          <w:tcPr>
-            <w:tcW w:type="dxa" w:w="2340"/>
+              <w:t xml:space="preserve">Low</w:t>
+            </w:r>
+          </w:p>
+        </w:tc>
+        <w:tc>
+          <w:tcPr>
+            <w:tcW w:type="dxa" w:w="1560"/>
             <w:shd w:fill="D9E2F3" w:color="auto" w:val="clear"/>
             <w:tcMar>
               <w:top w:type="dxa" w:w="90"/>
@@ -2468,13 +2470,13 @@
                 <w:sz w:val="19"/>
                 <w:szCs w:val="19"/>
               </w:rPr>
-              <w:t xml:space="preserve">Tallest cell (m)</w:t>
-            </w:r>
-          </w:p>
-        </w:tc>
-        <w:tc>
-          <w:tcPr>
-            <w:tcW w:type="dxa" w:w="2340"/>
+              <w:t xml:space="preserve">Moderate</w:t>
+            </w:r>
+          </w:p>
+        </w:tc>
+        <w:tc>
+          <w:tcPr>
+            <w:tcW w:type="dxa" w:w="1560"/>
             <w:shd w:fill="D9E2F3" w:color="auto" w:val="clear"/>
             <w:tcMar>
               <w:top w:type="dxa" w:w="90"/>
@@ -2492,13 +2494,13 @@
                 <w:sz w:val="19"/>
                 <w:szCs w:val="19"/>
               </w:rPr>
-              <w:t xml:space="preserve">Mean height (m)</w:t>
-            </w:r>
-          </w:p>
-        </w:tc>
-        <w:tc>
-          <w:tcPr>
-            <w:tcW w:type="dxa" w:w="2340"/>
+              <w:t xml:space="preserve">Considerable</w:t>
+            </w:r>
+          </w:p>
+        </w:tc>
+        <w:tc>
+          <w:tcPr>
+            <w:tcW w:type="dxa" w:w="1560"/>
             <w:shd w:fill="D9E2F3" w:color="auto" w:val="clear"/>
             <w:tcMar>
               <w:top w:type="dxa" w:w="90"/>
@@ -2516,7 +2518,55 @@
                 <w:sz w:val="19"/>
                 <w:szCs w:val="19"/>
               </w:rPr>
-              <w:t xml:space="preserve">Volume (km³)</w:t>
+              <w:t xml:space="preserve">High</w:t>
+            </w:r>
+          </w:p>
+        </w:tc>
+        <w:tc>
+          <w:tcPr>
+            <w:tcW w:type="dxa" w:w="1560"/>
+            <w:shd w:fill="D9E2F3" w:color="auto" w:val="clear"/>
+            <w:tcMar>
+              <w:top w:type="dxa" w:w="90"/>
+              <w:left w:type="dxa" w:w="120"/>
+              <w:bottom w:type="dxa" w:w="90"/>
+              <w:right w:type="dxa" w:w="120"/>
+            </w:tcMar>
+          </w:tcPr>
+          <w:p>
+            <w:r>
+              <w:rPr>
+                <w:b/>
+                <w:bCs/>
+                <w:color w:val="1F3864"/>
+                <w:sz w:val="19"/>
+                <w:szCs w:val="19"/>
+              </w:rPr>
+              <w:t xml:space="preserve">Extreme</w:t>
+            </w:r>
+          </w:p>
+        </w:tc>
+        <w:tc>
+          <w:tcPr>
+            <w:tcW w:type="dxa" w:w="1560"/>
+            <w:shd w:fill="D9E2F3" w:color="auto" w:val="clear"/>
+            <w:tcMar>
+              <w:top w:type="dxa" w:w="90"/>
+              <w:left w:type="dxa" w:w="120"/>
+              <w:bottom w:type="dxa" w:w="90"/>
+              <w:right w:type="dxa" w:w="120"/>
+            </w:tcMar>
+          </w:tcPr>
+          <w:p>
+            <w:r>
+              <w:rPr>
+                <w:b/>
+                <w:bCs/>
+                <w:color w:val="1F3864"/>
+                <w:sz w:val="19"/>
+                <w:szCs w:val="19"/>
+              </w:rPr>
+              <w:t xml:space="preserve">Total</w:t>
             </w:r>
           </w:p>
         </w:tc>
@@ -2527,70 +2577,112 @@
         </w:trPr>
         <w:tc>
           <w:tcPr>
-            <w:tcW w:type="dxa" w:w="2340"/>
-            <w:tcMar>
-              <w:top w:type="dxa" w:w="90"/>
-              <w:left w:type="dxa" w:w="120"/>
-              <w:bottom w:type="dxa" w:w="90"/>
-              <w:right w:type="dxa" w:w="120"/>
-            </w:tcMar>
-          </w:tcPr>
-          <w:p>
-            <w:r>
-              <w:rPr>
-                <w:color w:val="767171"/>
-                <w:sz w:val="19"/>
-                <w:szCs w:val="19"/>
-              </w:rPr>
-              <w:t xml:space="preserve"> </w:t>
-            </w:r>
-          </w:p>
-        </w:tc>
-        <w:tc>
-          <w:tcPr>
-            <w:tcW w:type="dxa" w:w="2340"/>
-            <w:tcMar>
-              <w:top w:type="dxa" w:w="90"/>
-              <w:left w:type="dxa" w:w="120"/>
-              <w:bottom w:type="dxa" w:w="90"/>
-              <w:right w:type="dxa" w:w="120"/>
-            </w:tcMar>
-          </w:tcPr>
-          <w:p>
-            <w:r>
-              <w:rPr>
-                <w:color w:val="767171"/>
-                <w:sz w:val="19"/>
-                <w:szCs w:val="19"/>
-              </w:rPr>
-              <w:t xml:space="preserve"> </w:t>
-            </w:r>
-          </w:p>
-        </w:tc>
-        <w:tc>
-          <w:tcPr>
-            <w:tcW w:type="dxa" w:w="2340"/>
-            <w:tcMar>
-              <w:top w:type="dxa" w:w="90"/>
-              <w:left w:type="dxa" w:w="120"/>
-              <w:bottom w:type="dxa" w:w="90"/>
-              <w:right w:type="dxa" w:w="120"/>
-            </w:tcMar>
-          </w:tcPr>
-          <w:p>
-            <w:r>
-              <w:rPr>
-                <w:color w:val="767171"/>
-                <w:sz w:val="19"/>
-                <w:szCs w:val="19"/>
-              </w:rPr>
-              <w:t xml:space="preserve"> </w:t>
-            </w:r>
-          </w:p>
-        </w:tc>
-        <w:tc>
-          <w:tcPr>
-            <w:tcW w:type="dxa" w:w="2340"/>
+            <w:tcW w:type="dxa" w:w="1560"/>
+            <w:tcMar>
+              <w:top w:type="dxa" w:w="90"/>
+              <w:left w:type="dxa" w:w="120"/>
+              <w:bottom w:type="dxa" w:w="90"/>
+              <w:right w:type="dxa" w:w="120"/>
+            </w:tcMar>
+          </w:tcPr>
+          <w:p>
+            <w:r>
+              <w:rPr>
+                <w:color w:val="767171"/>
+                <w:sz w:val="19"/>
+                <w:szCs w:val="19"/>
+              </w:rPr>
+              <w:t xml:space="preserve"> </w:t>
+            </w:r>
+          </w:p>
+        </w:tc>
+        <w:tc>
+          <w:tcPr>
+            <w:tcW w:type="dxa" w:w="1560"/>
+            <w:tcMar>
+              <w:top w:type="dxa" w:w="90"/>
+              <w:left w:type="dxa" w:w="120"/>
+              <w:bottom w:type="dxa" w:w="90"/>
+              <w:right w:type="dxa" w:w="120"/>
+            </w:tcMar>
+          </w:tcPr>
+          <w:p>
+            <w:r>
+              <w:rPr>
+                <w:color w:val="767171"/>
+                <w:sz w:val="19"/>
+                <w:szCs w:val="19"/>
+              </w:rPr>
+              <w:t xml:space="preserve"> </w:t>
+            </w:r>
+          </w:p>
+        </w:tc>
+        <w:tc>
+          <w:tcPr>
+            <w:tcW w:type="dxa" w:w="1560"/>
+            <w:tcMar>
+              <w:top w:type="dxa" w:w="90"/>
+              <w:left w:type="dxa" w:w="120"/>
+              <w:bottom w:type="dxa" w:w="90"/>
+              <w:right w:type="dxa" w:w="120"/>
+            </w:tcMar>
+          </w:tcPr>
+          <w:p>
+            <w:r>
+              <w:rPr>
+                <w:color w:val="767171"/>
+                <w:sz w:val="19"/>
+                <w:szCs w:val="19"/>
+              </w:rPr>
+              <w:t xml:space="preserve"> </w:t>
+            </w:r>
+          </w:p>
+        </w:tc>
+        <w:tc>
+          <w:tcPr>
+            <w:tcW w:type="dxa" w:w="1560"/>
+            <w:tcMar>
+              <w:top w:type="dxa" w:w="90"/>
+              <w:left w:type="dxa" w:w="120"/>
+              <w:bottom w:type="dxa" w:w="90"/>
+              <w:right w:type="dxa" w:w="120"/>
+            </w:tcMar>
+          </w:tcPr>
+          <w:p>
+            <w:r>
+              <w:rPr>
+                <w:color w:val="767171"/>
+                <w:sz w:val="19"/>
+                <w:szCs w:val="19"/>
+              </w:rPr>
+              <w:t xml:space="preserve"> </w:t>
+            </w:r>
+          </w:p>
+        </w:tc>
+        <w:tc>
+          <w:tcPr>
+            <w:tcW w:type="dxa" w:w="1560"/>
+            <w:tcMar>
+              <w:top w:type="dxa" w:w="90"/>
+              <w:left w:type="dxa" w:w="120"/>
+              <w:bottom w:type="dxa" w:w="90"/>
+              <w:right w:type="dxa" w:w="120"/>
+            </w:tcMar>
+          </w:tcPr>
+          <w:p>
+            <w:r>
+              <w:rPr>
+                <w:color w:val="767171"/>
+                <w:sz w:val="19"/>
+                <w:szCs w:val="19"/>
+              </w:rPr>
+              <w:t xml:space="preserve"> </w:t>
+            </w:r>
+          </w:p>
+        </w:tc>
+        <w:tc>
+          <w:tcPr>
+            <w:tcW w:type="dxa" w:w="1560"/>
             <w:tcMar>
               <w:top w:type="dxa" w:w="90"/>
               <w:left w:type="dxa" w:w="120"/>
@@ -2624,12 +2716,7 @@
           <w:sz w:val="19"/>
           <w:szCs w:val="19"/>
         </w:rPr>
-        <w:t xml:space="preserve">Table 3. Baseline check values (IDW, 1,000 points, seed 1, reference outline).</w:t>
-      </w:r>
-    </w:p>
-    <w:p>
-      <w:r>
-        <w:br w:type="page"/>
+        <w:t xml:space="preserve">Table 3. Snowbird’s area in each hazard class at shift 0 (km²), geometric mean.</w:t>
       </w:r>
     </w:p>
     <w:p>
@@ -2645,7 +2732,7 @@
           <w:sz w:val="28"/>
           <w:szCs w:val="28"/>
         </w:rPr>
-        <w:t xml:space="preserve">5.  Testing the Assumptions</w:t>
+        <w:t xml:space="preserve">5.  All Three Agree</w:t>
       </w:r>
     </w:p>
     <w:p>
@@ -2660,7 +2747,57 @@
           <w:sz w:val="19"/>
           <w:szCs w:val="19"/>
         </w:rPr>
-        <w:t xml:space="preserve">Rubric: one table with the baseline and the four Step 9 runs, with the points kept, the outline area, the volume, the tallest cell and the cells below the plain (4 points). Step 9 says where to read each value.</w:t>
+        <w:t xml:space="preserve">Rubric: the “all three agree” result and why it is the wrong answer (2 points). Give its check value — how much of Snowbird it leaves unclassified — and explain, with one cell as an example, what the rule throws away.</w:t>
+      </w:r>
+    </w:p>
+    <w:p>
+      <w:pPr>
+        <w:spacing w:after="260" w:before="0"/>
+      </w:pPr>
+      <w:r>
+        <w:rPr>
+          <w:i/>
+          <w:iCs/>
+          <w:color w:val="767171"/>
+          <w:highlight w:val="yellow"/>
+        </w:rPr>
+        <w:t xml:space="preserve">[Add your content here.]</w:t>
+      </w:r>
+    </w:p>
+    <w:p>
+      <w:r>
+        <w:br w:type="page"/>
+      </w:r>
+    </w:p>
+    <w:p>
+      <w:pPr>
+        <w:pStyle w:val="Heading1"/>
+        <w:spacing w:after="80" w:before="280"/>
+      </w:pPr>
+      <w:r>
+        <w:rPr>
+          <w:b/>
+          <w:bCs/>
+          <w:color w:val="1F3864"/>
+          <w:sz w:val="28"/>
+          <w:szCs w:val="28"/>
+        </w:rPr>
+        <w:t xml:space="preserve">6.  Elevation Bands and Combination Rules</w:t>
+      </w:r>
+    </w:p>
+    <w:p>
+      <w:pPr>
+        <w:spacing w:after="160" w:before="60"/>
+      </w:pPr>
+      <w:r>
+        <w:rPr>
+          <w:i/>
+          <w:iCs/>
+          <w:color w:val="767171"/>
+          <w:sz w:val="19"/>
+          <w:szCs w:val="19"/>
+        </w:rPr>
+        <w:t xml:space="preserve">Rubric: one table with the baseline and at least three more runs, giving the shift, the altitude-class-5 area, and the High + Extreme area of Snowbird under each of the three rules (4 points). Choose your shifts deliberately and say why.</w:t>
       </w:r>
     </w:p>
     <w:p>
@@ -2690,13 +2827,12 @@
         </w:tblBorders>
       </w:tblPr>
       <w:tblGrid>
-        <w:gridCol w:w="1250"/>
-        <w:gridCol w:w="1600"/>
-        <w:gridCol w:w="1100"/>
-        <w:gridCol w:w="1350"/>
-        <w:gridCol w:w="1250"/>
-        <w:gridCol w:w="1300"/>
-        <w:gridCol w:w="1510"/>
+        <w:gridCol w:w="1200"/>
+        <w:gridCol w:w="1000"/>
+        <w:gridCol w:w="1500"/>
+        <w:gridCol w:w="1900"/>
+        <w:gridCol w:w="1880"/>
+        <w:gridCol w:w="1880"/>
       </w:tblGrid>
       <w:tr>
         <w:trPr>
@@ -2705,7 +2841,7 @@
         </w:trPr>
         <w:tc>
           <w:tcPr>
-            <w:tcW w:type="dxa" w:w="1250"/>
+            <w:tcW w:type="dxa" w:w="1200"/>
             <w:shd w:fill="D9E2F3" w:color="auto" w:val="clear"/>
             <w:tcMar>
               <w:top w:type="dxa" w:w="90"/>
@@ -2729,7 +2865,7 @@
         </w:tc>
         <w:tc>
           <w:tcPr>
-            <w:tcW w:type="dxa" w:w="1600"/>
+            <w:tcW w:type="dxa" w:w="1000"/>
             <w:shd w:fill="D9E2F3" w:color="auto" w:val="clear"/>
             <w:tcMar>
               <w:top w:type="dxa" w:w="90"/>
@@ -2747,13 +2883,13 @@
                 <w:sz w:val="19"/>
                 <w:szCs w:val="19"/>
               </w:rPr>
-              <w:t xml:space="preserve">What changed</w:t>
-            </w:r>
-          </w:p>
-        </w:tc>
-        <w:tc>
-          <w:tcPr>
-            <w:tcW w:type="dxa" w:w="1100"/>
+              <w:t xml:space="preserve">Shift (m)</w:t>
+            </w:r>
+          </w:p>
+        </w:tc>
+        <w:tc>
+          <w:tcPr>
+            <w:tcW w:type="dxa" w:w="1500"/>
             <w:shd w:fill="D9E2F3" w:color="auto" w:val="clear"/>
             <w:tcMar>
               <w:top w:type="dxa" w:w="90"/>
@@ -2771,13 +2907,13 @@
                 <w:sz w:val="19"/>
                 <w:szCs w:val="19"/>
               </w:rPr>
-              <w:t xml:space="preserve">Points kept</w:t>
-            </w:r>
-          </w:p>
-        </w:tc>
-        <w:tc>
-          <w:tcPr>
-            <w:tcW w:type="dxa" w:w="1350"/>
+              <w:t xml:space="preserve">Altitude class 5</w:t>
+            </w:r>
+          </w:p>
+        </w:tc>
+        <w:tc>
+          <w:tcPr>
+            <w:tcW w:type="dxa" w:w="1900"/>
             <w:shd w:fill="D9E2F3" w:color="auto" w:val="clear"/>
             <w:tcMar>
               <w:top w:type="dxa" w:w="90"/>
@@ -2795,13 +2931,13 @@
                 <w:sz w:val="19"/>
                 <w:szCs w:val="19"/>
               </w:rPr>
-              <w:t xml:space="preserve">Outline area (km²)</w:t>
-            </w:r>
-          </w:p>
-        </w:tc>
-        <w:tc>
-          <w:tcPr>
-            <w:tcW w:type="dxa" w:w="1250"/>
+              <w:t xml:space="preserve">High + Extreme, geometric mean</w:t>
+            </w:r>
+          </w:p>
+        </w:tc>
+        <w:tc>
+          <w:tcPr>
+            <w:tcW w:type="dxa" w:w="1880"/>
             <w:shd w:fill="D9E2F3" w:color="auto" w:val="clear"/>
             <w:tcMar>
               <w:top w:type="dxa" w:w="90"/>
@@ -2819,13 +2955,13 @@
                 <w:sz w:val="19"/>
                 <w:szCs w:val="19"/>
               </w:rPr>
-              <w:t xml:space="preserve">Volume (km³)</w:t>
-            </w:r>
-          </w:p>
-        </w:tc>
-        <w:tc>
-          <w:tcPr>
-            <w:tcW w:type="dxa" w:w="1300"/>
+              <w:t xml:space="preserve">High + Extreme, worst factor</w:t>
+            </w:r>
+          </w:p>
+        </w:tc>
+        <w:tc>
+          <w:tcPr>
+            <w:tcW w:type="dxa" w:w="1880"/>
             <w:shd w:fill="D9E2F3" w:color="auto" w:val="clear"/>
             <w:tcMar>
               <w:top w:type="dxa" w:w="90"/>
@@ -2843,31 +2979,7 @@
                 <w:sz w:val="19"/>
                 <w:szCs w:val="19"/>
               </w:rPr>
-              <w:t xml:space="preserve">Tallest cell (m)</w:t>
-            </w:r>
-          </w:p>
-        </w:tc>
-        <w:tc>
-          <w:tcPr>
-            <w:tcW w:type="dxa" w:w="1510"/>
-            <w:shd w:fill="D9E2F3" w:color="auto" w:val="clear"/>
-            <w:tcMar>
-              <w:top w:type="dxa" w:w="90"/>
-              <w:left w:type="dxa" w:w="120"/>
-              <w:bottom w:type="dxa" w:w="90"/>
-              <w:right w:type="dxa" w:w="120"/>
-            </w:tcMar>
-          </w:tcPr>
-          <w:p>
-            <w:r>
-              <w:rPr>
-                <w:b/>
-                <w:bCs/>
-                <w:color w:val="1F3864"/>
-                <w:sz w:val="19"/>
-                <w:szCs w:val="19"/>
-              </w:rPr>
-              <w:t xml:space="preserve">Cells below the plain</w:t>
+              <w:t xml:space="preserve">High + Extreme, best factor</w:t>
             </w:r>
           </w:p>
         </w:tc>
@@ -2878,7 +2990,7 @@
         </w:trPr>
         <w:tc>
           <w:tcPr>
-            <w:tcW w:type="dxa" w:w="1250"/>
+            <w:tcW w:type="dxa" w:w="1200"/>
             <w:tcMar>
               <w:top w:type="dxa" w:w="90"/>
               <w:left w:type="dxa" w:w="120"/>
@@ -2899,7 +3011,7 @@
         </w:tc>
         <w:tc>
           <w:tcPr>
-            <w:tcW w:type="dxa" w:w="1600"/>
+            <w:tcW w:type="dxa" w:w="1000"/>
             <w:tcMar>
               <w:top w:type="dxa" w:w="90"/>
               <w:left w:type="dxa" w:w="120"/>
@@ -2914,97 +3026,76 @@
                 <w:sz w:val="19"/>
                 <w:szCs w:val="19"/>
               </w:rPr>
-              <w:t xml:space="preserve">Nothing</w:t>
-            </w:r>
-          </w:p>
-        </w:tc>
-        <w:tc>
-          <w:tcPr>
-            <w:tcW w:type="dxa" w:w="1100"/>
-            <w:tcMar>
-              <w:top w:type="dxa" w:w="90"/>
-              <w:left w:type="dxa" w:w="120"/>
-              <w:bottom w:type="dxa" w:w="90"/>
-              <w:right w:type="dxa" w:w="120"/>
-            </w:tcMar>
-          </w:tcPr>
-          <w:p>
-            <w:r>
-              <w:rPr>
-                <w:color w:val="767171"/>
-                <w:sz w:val="19"/>
-                <w:szCs w:val="19"/>
-              </w:rPr>
-              <w:t xml:space="preserve"> </w:t>
-            </w:r>
-          </w:p>
-        </w:tc>
-        <w:tc>
-          <w:tcPr>
-            <w:tcW w:type="dxa" w:w="1350"/>
-            <w:tcMar>
-              <w:top w:type="dxa" w:w="90"/>
-              <w:left w:type="dxa" w:w="120"/>
-              <w:bottom w:type="dxa" w:w="90"/>
-              <w:right w:type="dxa" w:w="120"/>
-            </w:tcMar>
-          </w:tcPr>
-          <w:p>
-            <w:r>
-              <w:rPr>
-                <w:color w:val="767171"/>
-                <w:sz w:val="19"/>
-                <w:szCs w:val="19"/>
-              </w:rPr>
-              <w:t xml:space="preserve"> </w:t>
-            </w:r>
-          </w:p>
-        </w:tc>
-        <w:tc>
-          <w:tcPr>
-            <w:tcW w:type="dxa" w:w="1250"/>
-            <w:tcMar>
-              <w:top w:type="dxa" w:w="90"/>
-              <w:left w:type="dxa" w:w="120"/>
-              <w:bottom w:type="dxa" w:w="90"/>
-              <w:right w:type="dxa" w:w="120"/>
-            </w:tcMar>
-          </w:tcPr>
-          <w:p>
-            <w:r>
-              <w:rPr>
-                <w:color w:val="767171"/>
-                <w:sz w:val="19"/>
-                <w:szCs w:val="19"/>
-              </w:rPr>
-              <w:t xml:space="preserve"> </w:t>
-            </w:r>
-          </w:p>
-        </w:tc>
-        <w:tc>
-          <w:tcPr>
-            <w:tcW w:type="dxa" w:w="1300"/>
-            <w:tcMar>
-              <w:top w:type="dxa" w:w="90"/>
-              <w:left w:type="dxa" w:w="120"/>
-              <w:bottom w:type="dxa" w:w="90"/>
-              <w:right w:type="dxa" w:w="120"/>
-            </w:tcMar>
-          </w:tcPr>
-          <w:p>
-            <w:r>
-              <w:rPr>
-                <w:color w:val="767171"/>
-                <w:sz w:val="19"/>
-                <w:szCs w:val="19"/>
-              </w:rPr>
-              <w:t xml:space="preserve"> </w:t>
-            </w:r>
-          </w:p>
-        </w:tc>
-        <w:tc>
-          <w:tcPr>
-            <w:tcW w:type="dxa" w:w="1510"/>
+              <w:t xml:space="preserve">0</w:t>
+            </w:r>
+          </w:p>
+        </w:tc>
+        <w:tc>
+          <w:tcPr>
+            <w:tcW w:type="dxa" w:w="1500"/>
+            <w:tcMar>
+              <w:top w:type="dxa" w:w="90"/>
+              <w:left w:type="dxa" w:w="120"/>
+              <w:bottom w:type="dxa" w:w="90"/>
+              <w:right w:type="dxa" w:w="120"/>
+            </w:tcMar>
+          </w:tcPr>
+          <w:p>
+            <w:r>
+              <w:rPr>
+                <w:color w:val="767171"/>
+                <w:sz w:val="19"/>
+                <w:szCs w:val="19"/>
+              </w:rPr>
+              <w:t xml:space="preserve"> </w:t>
+            </w:r>
+          </w:p>
+        </w:tc>
+        <w:tc>
+          <w:tcPr>
+            <w:tcW w:type="dxa" w:w="1900"/>
+            <w:tcMar>
+              <w:top w:type="dxa" w:w="90"/>
+              <w:left w:type="dxa" w:w="120"/>
+              <w:bottom w:type="dxa" w:w="90"/>
+              <w:right w:type="dxa" w:w="120"/>
+            </w:tcMar>
+          </w:tcPr>
+          <w:p>
+            <w:r>
+              <w:rPr>
+                <w:color w:val="767171"/>
+                <w:sz w:val="19"/>
+                <w:szCs w:val="19"/>
+              </w:rPr>
+              <w:t xml:space="preserve"> </w:t>
+            </w:r>
+          </w:p>
+        </w:tc>
+        <w:tc>
+          <w:tcPr>
+            <w:tcW w:type="dxa" w:w="1880"/>
+            <w:tcMar>
+              <w:top w:type="dxa" w:w="90"/>
+              <w:left w:type="dxa" w:w="120"/>
+              <w:bottom w:type="dxa" w:w="90"/>
+              <w:right w:type="dxa" w:w="120"/>
+            </w:tcMar>
+          </w:tcPr>
+          <w:p>
+            <w:r>
+              <w:rPr>
+                <w:color w:val="767171"/>
+                <w:sz w:val="19"/>
+                <w:szCs w:val="19"/>
+              </w:rPr>
+              <w:t xml:space="preserve"> </w:t>
+            </w:r>
+          </w:p>
+        </w:tc>
+        <w:tc>
+          <w:tcPr>
+            <w:tcW w:type="dxa" w:w="1880"/>
             <w:tcMar>
               <w:top w:type="dxa" w:w="90"/>
               <w:left w:type="dxa" w:w="120"/>
@@ -3030,7 +3121,7 @@
         </w:trPr>
         <w:tc>
           <w:tcPr>
-            <w:tcW w:type="dxa" w:w="1250"/>
+            <w:tcW w:type="dxa" w:w="1200"/>
             <w:shd w:fill="F2F2F2" w:color="auto" w:val="clear"/>
             <w:tcMar>
               <w:top w:type="dxa" w:w="90"/>
@@ -3042,17 +3133,17 @@
           <w:p>
             <w:r>
               <w:rPr>
-                <w:color w:val="000000"/>
-                <w:sz w:val="19"/>
-                <w:szCs w:val="19"/>
-              </w:rPr>
-              <w:t xml:space="preserve">250 points</w:t>
-            </w:r>
-          </w:p>
-        </w:tc>
-        <w:tc>
-          <w:tcPr>
-            <w:tcW w:type="dxa" w:w="1600"/>
+                <w:color w:val="767171"/>
+                <w:sz w:val="19"/>
+                <w:szCs w:val="19"/>
+              </w:rPr>
+              <w:t xml:space="preserve"> </w:t>
+            </w:r>
+          </w:p>
+        </w:tc>
+        <w:tc>
+          <w:tcPr>
+            <w:tcW w:type="dxa" w:w="1000"/>
             <w:shd w:fill="F2F2F2" w:color="auto" w:val="clear"/>
             <w:tcMar>
               <w:top w:type="dxa" w:w="90"/>
@@ -3074,7 +3165,7 @@
         </w:tc>
         <w:tc>
           <w:tcPr>
-            <w:tcW w:type="dxa" w:w="1100"/>
+            <w:tcW w:type="dxa" w:w="1500"/>
             <w:shd w:fill="F2F2F2" w:color="auto" w:val="clear"/>
             <w:tcMar>
               <w:top w:type="dxa" w:w="90"/>
@@ -3096,7 +3187,7 @@
         </w:tc>
         <w:tc>
           <w:tcPr>
-            <w:tcW w:type="dxa" w:w="1350"/>
+            <w:tcW w:type="dxa" w:w="1900"/>
             <w:shd w:fill="F2F2F2" w:color="auto" w:val="clear"/>
             <w:tcMar>
               <w:top w:type="dxa" w:w="90"/>
@@ -3118,7 +3209,7 @@
         </w:tc>
         <w:tc>
           <w:tcPr>
-            <w:tcW w:type="dxa" w:w="1250"/>
+            <w:tcW w:type="dxa" w:w="1880"/>
             <w:shd w:fill="F2F2F2" w:color="auto" w:val="clear"/>
             <w:tcMar>
               <w:top w:type="dxa" w:w="90"/>
@@ -3140,29 +3231,7 @@
         </w:tc>
         <w:tc>
           <w:tcPr>
-            <w:tcW w:type="dxa" w:w="1300"/>
-            <w:shd w:fill="F2F2F2" w:color="auto" w:val="clear"/>
-            <w:tcMar>
-              <w:top w:type="dxa" w:w="90"/>
-              <w:left w:type="dxa" w:w="120"/>
-              <w:bottom w:type="dxa" w:w="90"/>
-              <w:right w:type="dxa" w:w="120"/>
-            </w:tcMar>
-          </w:tcPr>
-          <w:p>
-            <w:r>
-              <w:rPr>
-                <w:color w:val="767171"/>
-                <w:sz w:val="19"/>
-                <w:szCs w:val="19"/>
-              </w:rPr>
-              <w:t xml:space="preserve"> </w:t>
-            </w:r>
-          </w:p>
-        </w:tc>
-        <w:tc>
-          <w:tcPr>
-            <w:tcW w:type="dxa" w:w="1510"/>
+            <w:tcW w:type="dxa" w:w="1880"/>
             <w:shd w:fill="F2F2F2" w:color="auto" w:val="clear"/>
             <w:tcMar>
               <w:top w:type="dxa" w:w="90"/>
@@ -3189,133 +3258,112 @@
         </w:trPr>
         <w:tc>
           <w:tcPr>
-            <w:tcW w:type="dxa" w:w="1250"/>
-            <w:tcMar>
-              <w:top w:type="dxa" w:w="90"/>
-              <w:left w:type="dxa" w:w="120"/>
-              <w:bottom w:type="dxa" w:w="90"/>
-              <w:right w:type="dxa" w:w="120"/>
-            </w:tcMar>
-          </w:tcPr>
-          <w:p>
-            <w:r>
-              <w:rPr>
-                <w:color w:val="000000"/>
-                <w:sz w:val="19"/>
-                <w:szCs w:val="19"/>
-              </w:rPr>
-              <w:t xml:space="preserve">4,000 points</w:t>
-            </w:r>
-          </w:p>
-        </w:tc>
-        <w:tc>
-          <w:tcPr>
-            <w:tcW w:type="dxa" w:w="1600"/>
-            <w:tcMar>
-              <w:top w:type="dxa" w:w="90"/>
-              <w:left w:type="dxa" w:w="120"/>
-              <w:bottom w:type="dxa" w:w="90"/>
-              <w:right w:type="dxa" w:w="120"/>
-            </w:tcMar>
-          </w:tcPr>
-          <w:p>
-            <w:r>
-              <w:rPr>
-                <w:color w:val="767171"/>
-                <w:sz w:val="19"/>
-                <w:szCs w:val="19"/>
-              </w:rPr>
-              <w:t xml:space="preserve"> </w:t>
-            </w:r>
-          </w:p>
-        </w:tc>
-        <w:tc>
-          <w:tcPr>
-            <w:tcW w:type="dxa" w:w="1100"/>
-            <w:tcMar>
-              <w:top w:type="dxa" w:w="90"/>
-              <w:left w:type="dxa" w:w="120"/>
-              <w:bottom w:type="dxa" w:w="90"/>
-              <w:right w:type="dxa" w:w="120"/>
-            </w:tcMar>
-          </w:tcPr>
-          <w:p>
-            <w:r>
-              <w:rPr>
-                <w:color w:val="767171"/>
-                <w:sz w:val="19"/>
-                <w:szCs w:val="19"/>
-              </w:rPr>
-              <w:t xml:space="preserve"> </w:t>
-            </w:r>
-          </w:p>
-        </w:tc>
-        <w:tc>
-          <w:tcPr>
-            <w:tcW w:type="dxa" w:w="1350"/>
-            <w:tcMar>
-              <w:top w:type="dxa" w:w="90"/>
-              <w:left w:type="dxa" w:w="120"/>
-              <w:bottom w:type="dxa" w:w="90"/>
-              <w:right w:type="dxa" w:w="120"/>
-            </w:tcMar>
-          </w:tcPr>
-          <w:p>
-            <w:r>
-              <w:rPr>
-                <w:color w:val="767171"/>
-                <w:sz w:val="19"/>
-                <w:szCs w:val="19"/>
-              </w:rPr>
-              <w:t xml:space="preserve"> </w:t>
-            </w:r>
-          </w:p>
-        </w:tc>
-        <w:tc>
-          <w:tcPr>
-            <w:tcW w:type="dxa" w:w="1250"/>
-            <w:tcMar>
-              <w:top w:type="dxa" w:w="90"/>
-              <w:left w:type="dxa" w:w="120"/>
-              <w:bottom w:type="dxa" w:w="90"/>
-              <w:right w:type="dxa" w:w="120"/>
-            </w:tcMar>
-          </w:tcPr>
-          <w:p>
-            <w:r>
-              <w:rPr>
-                <w:color w:val="767171"/>
-                <w:sz w:val="19"/>
-                <w:szCs w:val="19"/>
-              </w:rPr>
-              <w:t xml:space="preserve"> </w:t>
-            </w:r>
-          </w:p>
-        </w:tc>
-        <w:tc>
-          <w:tcPr>
-            <w:tcW w:type="dxa" w:w="1300"/>
-            <w:tcMar>
-              <w:top w:type="dxa" w:w="90"/>
-              <w:left w:type="dxa" w:w="120"/>
-              <w:bottom w:type="dxa" w:w="90"/>
-              <w:right w:type="dxa" w:w="120"/>
-            </w:tcMar>
-          </w:tcPr>
-          <w:p>
-            <w:r>
-              <w:rPr>
-                <w:color w:val="767171"/>
-                <w:sz w:val="19"/>
-                <w:szCs w:val="19"/>
-              </w:rPr>
-              <w:t xml:space="preserve"> </w:t>
-            </w:r>
-          </w:p>
-        </w:tc>
-        <w:tc>
-          <w:tcPr>
-            <w:tcW w:type="dxa" w:w="1510"/>
+            <w:tcW w:type="dxa" w:w="1200"/>
+            <w:tcMar>
+              <w:top w:type="dxa" w:w="90"/>
+              <w:left w:type="dxa" w:w="120"/>
+              <w:bottom w:type="dxa" w:w="90"/>
+              <w:right w:type="dxa" w:w="120"/>
+            </w:tcMar>
+          </w:tcPr>
+          <w:p>
+            <w:r>
+              <w:rPr>
+                <w:color w:val="767171"/>
+                <w:sz w:val="19"/>
+                <w:szCs w:val="19"/>
+              </w:rPr>
+              <w:t xml:space="preserve"> </w:t>
+            </w:r>
+          </w:p>
+        </w:tc>
+        <w:tc>
+          <w:tcPr>
+            <w:tcW w:type="dxa" w:w="1000"/>
+            <w:tcMar>
+              <w:top w:type="dxa" w:w="90"/>
+              <w:left w:type="dxa" w:w="120"/>
+              <w:bottom w:type="dxa" w:w="90"/>
+              <w:right w:type="dxa" w:w="120"/>
+            </w:tcMar>
+          </w:tcPr>
+          <w:p>
+            <w:r>
+              <w:rPr>
+                <w:color w:val="767171"/>
+                <w:sz w:val="19"/>
+                <w:szCs w:val="19"/>
+              </w:rPr>
+              <w:t xml:space="preserve"> </w:t>
+            </w:r>
+          </w:p>
+        </w:tc>
+        <w:tc>
+          <w:tcPr>
+            <w:tcW w:type="dxa" w:w="1500"/>
+            <w:tcMar>
+              <w:top w:type="dxa" w:w="90"/>
+              <w:left w:type="dxa" w:w="120"/>
+              <w:bottom w:type="dxa" w:w="90"/>
+              <w:right w:type="dxa" w:w="120"/>
+            </w:tcMar>
+          </w:tcPr>
+          <w:p>
+            <w:r>
+              <w:rPr>
+                <w:color w:val="767171"/>
+                <w:sz w:val="19"/>
+                <w:szCs w:val="19"/>
+              </w:rPr>
+              <w:t xml:space="preserve"> </w:t>
+            </w:r>
+          </w:p>
+        </w:tc>
+        <w:tc>
+          <w:tcPr>
+            <w:tcW w:type="dxa" w:w="1900"/>
+            <w:tcMar>
+              <w:top w:type="dxa" w:w="90"/>
+              <w:left w:type="dxa" w:w="120"/>
+              <w:bottom w:type="dxa" w:w="90"/>
+              <w:right w:type="dxa" w:w="120"/>
+            </w:tcMar>
+          </w:tcPr>
+          <w:p>
+            <w:r>
+              <w:rPr>
+                <w:color w:val="767171"/>
+                <w:sz w:val="19"/>
+                <w:szCs w:val="19"/>
+              </w:rPr>
+              <w:t xml:space="preserve"> </w:t>
+            </w:r>
+          </w:p>
+        </w:tc>
+        <w:tc>
+          <w:tcPr>
+            <w:tcW w:type="dxa" w:w="1880"/>
+            <w:tcMar>
+              <w:top w:type="dxa" w:w="90"/>
+              <w:left w:type="dxa" w:w="120"/>
+              <w:bottom w:type="dxa" w:w="90"/>
+              <w:right w:type="dxa" w:w="120"/>
+            </w:tcMar>
+          </w:tcPr>
+          <w:p>
+            <w:r>
+              <w:rPr>
+                <w:color w:val="767171"/>
+                <w:sz w:val="19"/>
+                <w:szCs w:val="19"/>
+              </w:rPr>
+              <w:t xml:space="preserve"> </w:t>
+            </w:r>
+          </w:p>
+        </w:tc>
+        <w:tc>
+          <w:tcPr>
+            <w:tcW w:type="dxa" w:w="1880"/>
             <w:tcMar>
               <w:top w:type="dxa" w:w="90"/>
               <w:left w:type="dxa" w:w="120"/>
@@ -3341,7 +3389,7 @@
         </w:trPr>
         <w:tc>
           <w:tcPr>
-            <w:tcW w:type="dxa" w:w="1250"/>
+            <w:tcW w:type="dxa" w:w="1200"/>
             <w:shd w:fill="F2F2F2" w:color="auto" w:val="clear"/>
             <w:tcMar>
               <w:top w:type="dxa" w:w="90"/>
@@ -3353,17 +3401,17 @@
           <w:p>
             <w:r>
               <w:rPr>
-                <w:color w:val="000000"/>
-                <w:sz w:val="19"/>
-                <w:szCs w:val="19"/>
-              </w:rPr>
-              <w:t xml:space="preserve">Your own outline</w:t>
-            </w:r>
-          </w:p>
-        </w:tc>
-        <w:tc>
-          <w:tcPr>
-            <w:tcW w:type="dxa" w:w="1600"/>
+                <w:color w:val="767171"/>
+                <w:sz w:val="19"/>
+                <w:szCs w:val="19"/>
+              </w:rPr>
+              <w:t xml:space="preserve"> </w:t>
+            </w:r>
+          </w:p>
+        </w:tc>
+        <w:tc>
+          <w:tcPr>
+            <w:tcW w:type="dxa" w:w="1000"/>
             <w:shd w:fill="F2F2F2" w:color="auto" w:val="clear"/>
             <w:tcMar>
               <w:top w:type="dxa" w:w="90"/>
@@ -3385,7 +3433,7 @@
         </w:tc>
         <w:tc>
           <w:tcPr>
-            <w:tcW w:type="dxa" w:w="1100"/>
+            <w:tcW w:type="dxa" w:w="1500"/>
             <w:shd w:fill="F2F2F2" w:color="auto" w:val="clear"/>
             <w:tcMar>
               <w:top w:type="dxa" w:w="90"/>
@@ -3407,7 +3455,7 @@
         </w:tc>
         <w:tc>
           <w:tcPr>
-            <w:tcW w:type="dxa" w:w="1350"/>
+            <w:tcW w:type="dxa" w:w="1900"/>
             <w:shd w:fill="F2F2F2" w:color="auto" w:val="clear"/>
             <w:tcMar>
               <w:top w:type="dxa" w:w="90"/>
@@ -3429,7 +3477,7 @@
         </w:tc>
         <w:tc>
           <w:tcPr>
-            <w:tcW w:type="dxa" w:w="1250"/>
+            <w:tcW w:type="dxa" w:w="1880"/>
             <w:shd w:fill="F2F2F2" w:color="auto" w:val="clear"/>
             <w:tcMar>
               <w:top w:type="dxa" w:w="90"/>
@@ -3451,182 +3499,8 @@
         </w:tc>
         <w:tc>
           <w:tcPr>
-            <w:tcW w:type="dxa" w:w="1300"/>
+            <w:tcW w:type="dxa" w:w="1880"/>
             <w:shd w:fill="F2F2F2" w:color="auto" w:val="clear"/>
-            <w:tcMar>
-              <w:top w:type="dxa" w:w="90"/>
-              <w:left w:type="dxa" w:w="120"/>
-              <w:bottom w:type="dxa" w:w="90"/>
-              <w:right w:type="dxa" w:w="120"/>
-            </w:tcMar>
-          </w:tcPr>
-          <w:p>
-            <w:r>
-              <w:rPr>
-                <w:color w:val="767171"/>
-                <w:sz w:val="19"/>
-                <w:szCs w:val="19"/>
-              </w:rPr>
-              <w:t xml:space="preserve"> </w:t>
-            </w:r>
-          </w:p>
-        </w:tc>
-        <w:tc>
-          <w:tcPr>
-            <w:tcW w:type="dxa" w:w="1510"/>
-            <w:shd w:fill="F2F2F2" w:color="auto" w:val="clear"/>
-            <w:tcMar>
-              <w:top w:type="dxa" w:w="90"/>
-              <w:left w:type="dxa" w:w="120"/>
-              <w:bottom w:type="dxa" w:w="90"/>
-              <w:right w:type="dxa" w:w="120"/>
-            </w:tcMar>
-          </w:tcPr>
-          <w:p>
-            <w:r>
-              <w:rPr>
-                <w:color w:val="767171"/>
-                <w:sz w:val="19"/>
-                <w:szCs w:val="19"/>
-              </w:rPr>
-              <w:t xml:space="preserve"> </w:t>
-            </w:r>
-          </w:p>
-        </w:tc>
-      </w:tr>
-      <w:tr>
-        <w:trPr>
-          <w:cantSplit/>
-        </w:trPr>
-        <w:tc>
-          <w:tcPr>
-            <w:tcW w:type="dxa" w:w="1250"/>
-            <w:tcMar>
-              <w:top w:type="dxa" w:w="90"/>
-              <w:left w:type="dxa" w:w="120"/>
-              <w:bottom w:type="dxa" w:w="90"/>
-              <w:right w:type="dxa" w:w="120"/>
-            </w:tcMar>
-          </w:tcPr>
-          <w:p>
-            <w:r>
-              <w:rPr>
-                <w:color w:val="000000"/>
-                <w:sz w:val="19"/>
-                <w:szCs w:val="19"/>
-              </w:rPr>
-              <w:t xml:space="preserve">Spline</w:t>
-            </w:r>
-          </w:p>
-        </w:tc>
-        <w:tc>
-          <w:tcPr>
-            <w:tcW w:type="dxa" w:w="1600"/>
-            <w:tcMar>
-              <w:top w:type="dxa" w:w="90"/>
-              <w:left w:type="dxa" w:w="120"/>
-              <w:bottom w:type="dxa" w:w="90"/>
-              <w:right w:type="dxa" w:w="120"/>
-            </w:tcMar>
-          </w:tcPr>
-          <w:p>
-            <w:r>
-              <w:rPr>
-                <w:color w:val="767171"/>
-                <w:sz w:val="19"/>
-                <w:szCs w:val="19"/>
-              </w:rPr>
-              <w:t xml:space="preserve"> </w:t>
-            </w:r>
-          </w:p>
-        </w:tc>
-        <w:tc>
-          <w:tcPr>
-            <w:tcW w:type="dxa" w:w="1100"/>
-            <w:tcMar>
-              <w:top w:type="dxa" w:w="90"/>
-              <w:left w:type="dxa" w:w="120"/>
-              <w:bottom w:type="dxa" w:w="90"/>
-              <w:right w:type="dxa" w:w="120"/>
-            </w:tcMar>
-          </w:tcPr>
-          <w:p>
-            <w:r>
-              <w:rPr>
-                <w:color w:val="767171"/>
-                <w:sz w:val="19"/>
-                <w:szCs w:val="19"/>
-              </w:rPr>
-              <w:t xml:space="preserve"> </w:t>
-            </w:r>
-          </w:p>
-        </w:tc>
-        <w:tc>
-          <w:tcPr>
-            <w:tcW w:type="dxa" w:w="1350"/>
-            <w:tcMar>
-              <w:top w:type="dxa" w:w="90"/>
-              <w:left w:type="dxa" w:w="120"/>
-              <w:bottom w:type="dxa" w:w="90"/>
-              <w:right w:type="dxa" w:w="120"/>
-            </w:tcMar>
-          </w:tcPr>
-          <w:p>
-            <w:r>
-              <w:rPr>
-                <w:color w:val="767171"/>
-                <w:sz w:val="19"/>
-                <w:szCs w:val="19"/>
-              </w:rPr>
-              <w:t xml:space="preserve"> </w:t>
-            </w:r>
-          </w:p>
-        </w:tc>
-        <w:tc>
-          <w:tcPr>
-            <w:tcW w:type="dxa" w:w="1250"/>
-            <w:tcMar>
-              <w:top w:type="dxa" w:w="90"/>
-              <w:left w:type="dxa" w:w="120"/>
-              <w:bottom w:type="dxa" w:w="90"/>
-              <w:right w:type="dxa" w:w="120"/>
-            </w:tcMar>
-          </w:tcPr>
-          <w:p>
-            <w:r>
-              <w:rPr>
-                <w:color w:val="767171"/>
-                <w:sz w:val="19"/>
-                <w:szCs w:val="19"/>
-              </w:rPr>
-              <w:t xml:space="preserve"> </w:t>
-            </w:r>
-          </w:p>
-        </w:tc>
-        <w:tc>
-          <w:tcPr>
-            <w:tcW w:type="dxa" w:w="1300"/>
-            <w:tcMar>
-              <w:top w:type="dxa" w:w="90"/>
-              <w:left w:type="dxa" w:w="120"/>
-              <w:bottom w:type="dxa" w:w="90"/>
-              <w:right w:type="dxa" w:w="120"/>
-            </w:tcMar>
-          </w:tcPr>
-          <w:p>
-            <w:r>
-              <w:rPr>
-                <w:color w:val="767171"/>
-                <w:sz w:val="19"/>
-                <w:szCs w:val="19"/>
-              </w:rPr>
-              <w:t xml:space="preserve"> </w:t>
-            </w:r>
-          </w:p>
-        </w:tc>
-        <w:tc>
-          <w:tcPr>
-            <w:tcW w:type="dxa" w:w="1510"/>
             <w:tcMar>
               <w:top w:type="dxa" w:w="90"/>
               <w:left w:type="dxa" w:w="120"/>
@@ -3660,7 +3534,7 @@
           <w:sz w:val="19"/>
           <w:szCs w:val="19"/>
         </w:rPr>
-        <w:t xml:space="preserve">Table 4. Sensitivity — the baseline and the four Step 9 runs.</w:t>
+        <w:t xml:space="preserve">Table 4. Sensitivity — the baseline and at least three more runs (km² of Snowbird).</w:t>
       </w:r>
     </w:p>
     <w:p>
@@ -3676,7 +3550,7 @@
           <w:sz w:val="22"/>
           <w:szCs w:val="22"/>
         </w:rPr>
-        <w:t xml:space="preserve">Which choice moves the volume most, and which least? Rank them with your numbers. (3 points)</w:t>
+        <w:t xml:space="preserve">How much does moving the elevation bands change the map, in each direction? Use the altitude-class column to say why. (2 points)</w:t>
       </w:r>
     </w:p>
     <w:p>
@@ -3706,7 +3580,37 @@
           <w:sz w:val="22"/>
           <w:szCs w:val="22"/>
         </w:rPr>
-        <w:t xml:space="preserve">What did the spline do that IDW cannot? Map its cells below the plain and explain them with what you learned about the methods in Week 8. (3 points)</w:t>
+        <w:t xml:space="preserve">How much does the combination rule change the map? For the same run, compare the three rules. Which would you publish, and to whom? (2 points)</w:t>
+      </w:r>
+    </w:p>
+    <w:p>
+      <w:pPr>
+        <w:spacing w:after="260" w:before="0"/>
+      </w:pPr>
+      <w:r>
+        <w:rPr>
+          <w:i/>
+          <w:iCs/>
+          <w:color w:val="767171"/>
+          <w:highlight w:val="yellow"/>
+        </w:rPr>
+        <w:t xml:space="preserve">[Your answer here.]</w:t>
+      </w:r>
+    </w:p>
+    <w:p>
+      <w:pPr>
+        <w:pStyle w:val="Heading2"/>
+        <w:spacing w:after="60" w:before="220"/>
+      </w:pPr>
+      <w:r>
+        <w:rPr>
+          <w:b/>
+          <w:bCs/>
+          <w:color w:val="1F3864"/>
+          <w:sz w:val="22"/>
+          <w:szCs w:val="22"/>
+        </w:rPr>
+        <w:t xml:space="preserve">Where do the three rules agree, and where do they disagree most? Map Rule_Spread at shift 0 beside the imagery and say what terrain sits at 0 and at 4. (2 points)</w:t>
       </w:r>
     </w:p>
     <w:p>
@@ -3736,7 +3640,7 @@
           <w:sz w:val="28"/>
           <w:szCs w:val="28"/>
         </w:rPr>
-        <w:t xml:space="preserve">6.  What the Volume Measures</w:t>
+        <w:t xml:space="preserve">7.  Where the Map Is Wrong</w:t>
       </w:r>
     </w:p>
     <w:p>
@@ -3751,7 +3655,7 @@
           <w:sz w:val="19"/>
           <w:szCs w:val="19"/>
         </w:rPr>
-        <w:t xml:space="preserve">Rubric: what the volume measures and what the model cannot see (2 points). Step 9, question 3: is it the volume of the lava dome? Say what part of the dome the model cannot see, and what data would let you measure it.</w:t>
+        <w:t xml:space="preserve">Rubric: where the map is wrong and why, and what data would fix it (2 points). What the terrain-only model leaves out (snowpack, weather, wind loading, triggering, slope shape, ground cover, terrain traps), what a bare-earth 10 m DEM cannot show, and what Table 1 assumes — name each and the data that would fix it.</w:t>
       </w:r>
     </w:p>
     <w:p>
@@ -3786,7 +3690,7 @@
           <w:sz w:val="28"/>
           <w:szCs w:val="28"/>
         </w:rPr>
-        <w:t xml:space="preserve">7.  Maps</w:t>
+        <w:t xml:space="preserve">8.  Maps</w:t>
       </w:r>
     </w:p>
     <w:p>
@@ -3801,7 +3705,7 @@
           <w:sz w:val="19"/>
           <w:szCs w:val="19"/>
         </w:rPr>
-        <w:t xml:space="preserve">Both maps are full-page, 8.5 × 11. Put each on its own page. Use the same color scale for height on both, so a reader can compare them.</w:t>
+        <w:t xml:space="preserve">Both maps are full-page, 8.5 × 11. Put each on its own page. Use the danger-scale colors on both, so a reader can compare them.</w:t>
       </w:r>
     </w:p>
     <w:p>
@@ -3816,7 +3720,7 @@
           <w:sz w:val="19"/>
           <w:szCs w:val="19"/>
         </w:rPr>
-        <w:t xml:space="preserve">Must carry: title with the volume in it or in a text box; neat line, north arrow and scale bar; a text box with author, date, map projection, and the DEM’s source and date; height above the plain in a clear color scale with a legend in meters; the outline over a hillshade or imagery; an inset locating the butte in Idaho; scale and legibility appropriate to the butte.</w:t>
+        <w:t xml:space="preserve">Must carry: title stating the rule and the elevation bands; neat line, north arrow and scale bar; a text box with author, date, map projection, and the DEM’s source and date; the hazard classes in the danger-scale colors, labeled Low to Extreme in a legend; the Snowbird boundary and labeled places; an inset locating Little Cottonwood Canyon; basemap, scale and legibility appropriate to the ski area.</w:t>
       </w:r>
     </w:p>
     <w:tbl>
@@ -3877,7 +3781,7 @@
           <w:sz w:val="19"/>
           <w:szCs w:val="19"/>
         </w:rPr>
-        <w:t xml:space="preserve">Map 1. Baseline — height above the plain, IDW, reference outline.</w:t>
+        <w:t xml:space="preserve">Map 1. Baseline — the geometric mean at shift 0.</w:t>
       </w:r>
     </w:p>
     <w:p>
@@ -3897,7 +3801,7 @@
           <w:sz w:val="19"/>
           <w:szCs w:val="19"/>
         </w:rPr>
-        <w:t xml:space="preserve">Everything Map 1 needs except the inset, with the same color scale, plus: the title and text box say what changed from Map 1 and by how much.</w:t>
+        <w:t xml:space="preserve">Everything Map 1 needs except the inset, plus: the title and text box say what changed from Map 1 and why this run was chosen.</w:t>
       </w:r>
     </w:p>
     <w:tbl>
@@ -3958,7 +3862,7 @@
           <w:sz w:val="19"/>
           <w:szCs w:val="19"/>
         </w:rPr>
-        <w:t xml:space="preserve">Map 2. Scenario — your own outline or the spline, from Step 9.</w:t>
+        <w:t xml:space="preserve">Map 2. Scenario — a different shift or rule from Step 9.</w:t>
       </w:r>
     </w:p>
     <w:p>
@@ -3979,7 +3883,7 @@
           <w:sz w:val="28"/>
           <w:szCs w:val="28"/>
         </w:rPr>
-        <w:t xml:space="preserve">8.  References</w:t>
+        <w:t xml:space="preserve">9.  References</w:t>
       </w:r>
     </w:p>
     <w:p>
@@ -3994,7 +3898,7 @@
           <w:sz w:val="19"/>
           <w:szCs w:val="19"/>
         </w:rPr>
-        <w:t xml:space="preserve">Rubric: sources credited (part of the point for organized writing). Credit the DEM (both tiles), the reference outline, the USGS article, the basemap and anything else you relied on.</w:t>
+        <w:t xml:space="preserve">Rubric: sources credited (part of the point for organized writing). Credit the DEM, the ski-area layer, the advisory behind Table 1, the basemap and anything else you relied on.</w:t>
       </w:r>
     </w:p>
     <w:p>
@@ -4024,7 +3928,7 @@
           <w:sz w:val="28"/>
           <w:szCs w:val="28"/>
         </w:rPr>
-        <w:t xml:space="preserve">9.  AI Use Statement</w:t>
+        <w:t xml:space="preserve">10.  AI Use Statement</w:t>
       </w:r>
     </w:p>
     <w:p>
@@ -4039,7 +3943,7 @@
           <w:sz w:val="19"/>
           <w:szCs w:val="19"/>
         </w:rPr>
-        <w:t xml:space="preserve">Course policy: one line saying what you used AI for. If you used none, say that. Expressions, coordinate systems, volumes and counts come from your own work, never from a model. You do the work in ArcGIS Pro yourself: AI may not run it for you, put facts in your report you did not find, or redraw or “enhance” your figures (see the course AI policy).</w:t>
+        <w:t xml:space="preserve">Course policy: one line saying what you used AI for. If you used none, say that. Expressions, class breaks, coordinate systems and areas come from your own work, never from a model. You do the work in ArcGIS Pro yourself: AI may not run it for you, put facts in your report you did not find, or redraw or “enhance” your figures (see the course AI policy).</w:t>
       </w:r>
     </w:p>
     <w:p>
@@ -4074,7 +3978,7 @@
           <w:sz w:val="28"/>
           <w:szCs w:val="28"/>
         </w:rPr>
-        <w:t xml:space="preserve">10.  Self-Graded Rubric</w:t>
+        <w:t xml:space="preserve">11.  Self-Graded Rubric</w:t>
       </w:r>
     </w:p>
     <w:p>
@@ -4280,7 +4184,7 @@
                 <w:sz w:val="17"/>
                 <w:szCs w:val="17"/>
               </w:rPr>
-              <w:t xml:space="preserve">Your check values from Steps 4 to 8 (2)</w:t>
+              <w:t xml:space="preserve">The "all three agree" result and why it is the wrong answer (2)</w:t>
             </w:r>
           </w:p>
           <w:p>
@@ -4297,7 +4201,7 @@
                 <w:sz w:val="17"/>
                 <w:szCs w:val="17"/>
               </w:rPr>
-              <w:t xml:space="preserve">What the volume measures and what the model cannot see (Step 9, question 3) (2)</w:t>
+              <w:t xml:space="preserve">Where the map is wrong and why, and what data would fix it (2)</w:t>
             </w:r>
           </w:p>
           <w:p>
@@ -4412,7 +4316,7 @@
                 <w:sz w:val="17"/>
                 <w:szCs w:val="17"/>
               </w:rPr>
-              <w:t xml:space="preserve">The model runs end to end from its tool dialog and its baseline volume matches the check value (4)</w:t>
+              <w:t xml:space="preserve">The model runs end to end from its tool dialog and its Step 8 table of Snowbird's areas at shift 0 matches the check values (4)</w:t>
             </w:r>
           </w:p>
           <w:p>
@@ -4446,7 +4350,7 @@
                 <w:sz w:val="17"/>
                 <w:szCs w:val="17"/>
               </w:rPr>
-              <w:t xml:space="preserve">A screen capture of the tool dialog with the outline and the number of points exposed as parameters (2)</w:t>
+              <w:t xml:space="preserve">A screen capture of the toolbox interface with the shift parameter exposed (2)</w:t>
             </w:r>
           </w:p>
           <w:p>
@@ -4561,7 +4465,7 @@
                 <w:sz w:val="17"/>
                 <w:szCs w:val="17"/>
               </w:rPr>
-              <w:t xml:space="preserve">Title, with the volume in it or in a text box (1)</w:t>
+              <w:t xml:space="preserve">Title stating the rule and the elevation bands (1)</w:t>
             </w:r>
           </w:p>
           <w:p>
@@ -4612,7 +4516,7 @@
                 <w:sz w:val="17"/>
                 <w:szCs w:val="17"/>
               </w:rPr>
-              <w:t xml:space="preserve">Height above the plain in a clear color scale with a legend in meters (2)</w:t>
+              <w:t xml:space="preserve">The hazard classes in the danger-scale colors, labeled Low to Extreme in a legend (2)</w:t>
             </w:r>
           </w:p>
           <w:p>
@@ -4629,7 +4533,7 @@
                 <w:sz w:val="17"/>
                 <w:szCs w:val="17"/>
               </w:rPr>
-              <w:t xml:space="preserve">The outline over a hillshade or imagery (1)</w:t>
+              <w:t xml:space="preserve">The Snowbird boundary and labeled places (1)</w:t>
             </w:r>
           </w:p>
           <w:p>
@@ -4646,7 +4550,7 @@
                 <w:sz w:val="17"/>
                 <w:szCs w:val="17"/>
               </w:rPr>
-              <w:t xml:space="preserve">An inset locating the butte in Idaho (2)</w:t>
+              <w:t xml:space="preserve">An inset locating Little Cottonwood Canyon (2)</w:t>
             </w:r>
           </w:p>
           <w:p>
@@ -4663,7 +4567,7 @@
                 <w:sz w:val="17"/>
                 <w:szCs w:val="17"/>
               </w:rPr>
-              <w:t xml:space="preserve">Scale and legibility appropriate to the butte (2)</w:t>
+              <w:t xml:space="preserve">Basemap, scale and legibility appropriate to the ski area (2)</w:t>
             </w:r>
           </w:p>
         </w:tc>
@@ -4761,7 +4665,7 @@
                 <w:sz w:val="17"/>
                 <w:szCs w:val="17"/>
               </w:rPr>
-              <w:t xml:space="preserve">Title, with the volume in it or in a text box (1)</w:t>
+              <w:t xml:space="preserve">Title stating the rule and the elevation bands (1)</w:t>
             </w:r>
           </w:p>
           <w:p>
@@ -4812,7 +4716,7 @@
                 <w:sz w:val="17"/>
                 <w:szCs w:val="17"/>
               </w:rPr>
-              <w:t xml:space="preserve">Height above the plain in the same color scale as Map 1, with a legend (2)</w:t>
+              <w:t xml:space="preserve">The hazard classes in the danger-scale colors, labeled Low to Extreme in a legend (2)</w:t>
             </w:r>
           </w:p>
           <w:p>
@@ -4829,7 +4733,7 @@
                 <w:sz w:val="17"/>
                 <w:szCs w:val="17"/>
               </w:rPr>
-              <w:t xml:space="preserve">The outline used, over a hillshade or imagery (1)</w:t>
+              <w:t xml:space="preserve">The Snowbird boundary and labeled places (1)</w:t>
             </w:r>
           </w:p>
           <w:p>
@@ -4846,7 +4750,7 @@
                 <w:sz w:val="17"/>
                 <w:szCs w:val="17"/>
               </w:rPr>
-              <w:t xml:space="preserve">Title and text box say what changed from Map 1 and by how much (2)</w:t>
+              <w:t xml:space="preserve">Title and text box say what changed from Map 1 and why this run was chosen (2)</w:t>
             </w:r>
           </w:p>
           <w:p>
@@ -4863,7 +4767,7 @@
                 <w:sz w:val="17"/>
                 <w:szCs w:val="17"/>
               </w:rPr>
-              <w:t xml:space="preserve">Scale and legibility appropriate to the butte (2)</w:t>
+              <w:t xml:space="preserve">Basemap, scale and legibility appropriate to the ski area (2)</w:t>
             </w:r>
           </w:p>
         </w:tc>
@@ -4961,7 +4865,7 @@
                 <w:sz w:val="17"/>
                 <w:szCs w:val="17"/>
               </w:rPr>
-              <w:t xml:space="preserve">One table with the baseline and the four Step 9 runs (250 and 4,000 points, your own outline, the spline), with the points kept, the outline area, the volume, the tallest cell and the cells below the plain (4)</w:t>
+              <w:t xml:space="preserve">One table with the baseline and at least three more runs, giving the shift, the altitude-class-5 area, and the High + Extreme area of Snowbird under each of the three rules (4)</w:t>
             </w:r>
           </w:p>
           <w:p>
@@ -4978,7 +4882,7 @@
                 <w:sz w:val="17"/>
                 <w:szCs w:val="17"/>
               </w:rPr>
-              <w:t xml:space="preserve">Which choice moves the volume most and least, ranked with your numbers (3)</w:t>
+              <w:t xml:space="preserve">How much moving the elevation bands changes the map in each direction, and why (2)</w:t>
             </w:r>
           </w:p>
           <w:p>
@@ -4995,7 +4899,24 @@
                 <w:sz w:val="17"/>
                 <w:szCs w:val="17"/>
               </w:rPr>
-              <w:t xml:space="preserve">What the spline did that IDW cannot, mapped and explained (3)</w:t>
+              <w:t xml:space="preserve">How much the combination rule changes the map, and which rule you would publish and why (2)</w:t>
+            </w:r>
+          </w:p>
+          <w:p>
+            <w:pPr>
+              <w:pStyle w:val="ListParagraph"/>
+              <w:numPr>
+                <w:ilvl w:val="0"/>
+                <w:numId w:val="3"/>
+              </w:numPr>
+              <w:spacing w:after="40"/>
+            </w:pPr>
+            <w:r>
+              <w:rPr>
+                <w:sz w:val="17"/>
+                <w:szCs w:val="17"/>
+              </w:rPr>
+              <w:t xml:space="preserve">Where the rules agree and disagree (Rule_Spread), and what terrain that is (2)</w:t>
             </w:r>
           </w:p>
         </w:tc>

</xml_diff>

<commit_message>
Lab 8: cut the checkpoint test to lighten the lab
Some students are falling behind, so Step 8 loses the checkpoint test:
Extract Multi Values to Points on 200 hosted checkpoints, three squared-
difference fields, Summary Statistics and the checkpoint RMSEs. It largely
repeated the all-cell RMSE the model already computes. Its table row and the
"could you have known without the truth?" question go too, and its 2 rubric
points move one each to the other two questions (now 4 / 3 / 3).

Checkpoints is removed from the data zip and its READ-ME. The zip was
rebuilt by make_extract.py, and verify_package.py reproduced every other check
value from it unchanged. The report template is regenerated, and the Week 9
Thursday deck's Lab 8 slide is updated. Judging a surface from checkpoints is
still taught in that deck (Part 3) and its quiz.

Co-Authored-By: Claude Opus 5.5 <noreply@anthropic.com>
</commit_message>
<xml_diff>
--- a/docs/assignments/lab-08/lab08-report-template.docx
+++ b/docs/assignments/lab-08/lab08-report-template.docx
@@ -3006,7 +3006,7 @@
           <w:sz w:val="19"/>
           <w:szCs w:val="19"/>
         </w:rPr>
-        <w:t xml:space="preserve">Rubric: one table with your baseline and the five Step 8 runs, including run 5 at your own IDW power with your BYU ID’s last two digits, the RMSE of all three methods in every row, and a row with your baseline’s three checkpoint RMSEs (4 points).</w:t>
+        <w:t xml:space="preserve">Rubric: one table with your baseline and the five Step 8 runs, including run 5 at your own IDW power with your BYU ID’s last two digits, and the RMSE of all three methods in every row (4 points).</w:t>
       </w:r>
     </w:p>
     <w:p>
@@ -3300,7 +3300,7 @@
                 <w:sz w:val="19"/>
                 <w:szCs w:val="19"/>
               </w:rPr>
-              <w:t xml:space="preserve">Baseline, 200 checkpoints</w:t>
+              <w:t xml:space="preserve">1</w:t>
             </w:r>
           </w:p>
         </w:tc>
@@ -3322,7 +3322,7 @@
                 <w:sz w:val="19"/>
                 <w:szCs w:val="19"/>
               </w:rPr>
-              <w:t xml:space="preserve">RMSE at the checkpoints</w:t>
+              <w:t xml:space="preserve">Sample_Points_250, 2, Spherical</w:t>
             </w:r>
           </w:p>
         </w:tc>
@@ -3414,7 +3414,7 @@
                 <w:sz w:val="19"/>
                 <w:szCs w:val="19"/>
               </w:rPr>
-              <w:t xml:space="preserve">1</w:t>
+              <w:t xml:space="preserve">2</w:t>
             </w:r>
           </w:p>
         </w:tc>
@@ -3435,7 +3435,7 @@
                 <w:sz w:val="19"/>
                 <w:szCs w:val="19"/>
               </w:rPr>
-              <w:t xml:space="preserve">Sample_Points_250, 2, Spherical</w:t>
+              <w:t xml:space="preserve">Sample_Points_10000, 2, Spherical</w:t>
             </w:r>
           </w:p>
         </w:tc>
@@ -3525,7 +3525,7 @@
                 <w:sz w:val="19"/>
                 <w:szCs w:val="19"/>
               </w:rPr>
-              <w:t xml:space="preserve">2</w:t>
+              <w:t xml:space="preserve">3</w:t>
             </w:r>
           </w:p>
         </w:tc>
@@ -3547,7 +3547,7 @@
                 <w:sz w:val="19"/>
                 <w:szCs w:val="19"/>
               </w:rPr>
-              <w:t xml:space="preserve">Sample_Points_10000, 2, Spherical</w:t>
+              <w:t xml:space="preserve">Sample_Points_2500, 1, Exponential</w:t>
             </w:r>
           </w:p>
         </w:tc>
@@ -3639,7 +3639,7 @@
                 <w:sz w:val="19"/>
                 <w:szCs w:val="19"/>
               </w:rPr>
-              <w:t xml:space="preserve">3</w:t>
+              <w:t xml:space="preserve">4</w:t>
             </w:r>
           </w:p>
         </w:tc>
@@ -3660,7 +3660,7 @@
                 <w:sz w:val="19"/>
                 <w:szCs w:val="19"/>
               </w:rPr>
-              <w:t xml:space="preserve">Sample_Points_2500, 1, Exponential</w:t>
+              <w:t xml:space="preserve">Sample_Points_2500, 3, Gaussian</w:t>
             </w:r>
           </w:p>
         </w:tc>
@@ -3750,7 +3750,7 @@
                 <w:sz w:val="19"/>
                 <w:szCs w:val="19"/>
               </w:rPr>
-              <w:t xml:space="preserve">4</w:t>
+              <w:t xml:space="preserve">5 (my power)</w:t>
             </w:r>
           </w:p>
         </w:tc>
@@ -3772,7 +3772,7 @@
                 <w:sz w:val="19"/>
                 <w:szCs w:val="19"/>
               </w:rPr>
-              <w:t xml:space="preserve">Sample_Points_2500, 3, Gaussian</w:t>
+              <w:t xml:space="preserve">Sample_Points_2500, ____, Spherical</w:t>
             </w:r>
           </w:p>
         </w:tc>
@@ -3824,116 +3824,6 @@
           <w:tcPr>
             <w:tcW w:type="dxa" w:w="1560"/>
             <w:shd w:fill="F2F2F2" w:color="auto" w:val="clear"/>
-            <w:tcMar>
-              <w:top w:type="dxa" w:w="90"/>
-              <w:left w:type="dxa" w:w="120"/>
-              <w:bottom w:type="dxa" w:w="90"/>
-              <w:right w:type="dxa" w:w="120"/>
-            </w:tcMar>
-          </w:tcPr>
-          <w:p>
-            <w:r>
-              <w:rPr>
-                <w:color w:val="767171"/>
-                <w:sz w:val="19"/>
-                <w:szCs w:val="19"/>
-              </w:rPr>
-              <w:t xml:space="preserve"> </w:t>
-            </w:r>
-          </w:p>
-        </w:tc>
-      </w:tr>
-      <w:tr>
-        <w:trPr>
-          <w:cantSplit/>
-        </w:trPr>
-        <w:tc>
-          <w:tcPr>
-            <w:tcW w:type="dxa" w:w="1700"/>
-            <w:tcMar>
-              <w:top w:type="dxa" w:w="90"/>
-              <w:left w:type="dxa" w:w="120"/>
-              <w:bottom w:type="dxa" w:w="90"/>
-              <w:right w:type="dxa" w:w="120"/>
-            </w:tcMar>
-          </w:tcPr>
-          <w:p>
-            <w:r>
-              <w:rPr>
-                <w:color w:val="000000"/>
-                <w:sz w:val="19"/>
-                <w:szCs w:val="19"/>
-              </w:rPr>
-              <w:t xml:space="preserve">5 (my power)</w:t>
-            </w:r>
-          </w:p>
-        </w:tc>
-        <w:tc>
-          <w:tcPr>
-            <w:tcW w:type="dxa" w:w="3060"/>
-            <w:tcMar>
-              <w:top w:type="dxa" w:w="90"/>
-              <w:left w:type="dxa" w:w="120"/>
-              <w:bottom w:type="dxa" w:w="90"/>
-              <w:right w:type="dxa" w:w="120"/>
-            </w:tcMar>
-          </w:tcPr>
-          <w:p>
-            <w:r>
-              <w:rPr>
-                <w:color w:val="000000"/>
-                <w:sz w:val="19"/>
-                <w:szCs w:val="19"/>
-              </w:rPr>
-              <w:t xml:space="preserve">Sample_Points_2500, ____, Spherical</w:t>
-            </w:r>
-          </w:p>
-        </w:tc>
-        <w:tc>
-          <w:tcPr>
-            <w:tcW w:type="dxa" w:w="1540"/>
-            <w:tcMar>
-              <w:top w:type="dxa" w:w="90"/>
-              <w:left w:type="dxa" w:w="120"/>
-              <w:bottom w:type="dxa" w:w="90"/>
-              <w:right w:type="dxa" w:w="120"/>
-            </w:tcMar>
-          </w:tcPr>
-          <w:p>
-            <w:r>
-              <w:rPr>
-                <w:color w:val="767171"/>
-                <w:sz w:val="19"/>
-                <w:szCs w:val="19"/>
-              </w:rPr>
-              <w:t xml:space="preserve"> </w:t>
-            </w:r>
-          </w:p>
-        </w:tc>
-        <w:tc>
-          <w:tcPr>
-            <w:tcW w:type="dxa" w:w="1500"/>
-            <w:tcMar>
-              <w:top w:type="dxa" w:w="90"/>
-              <w:left w:type="dxa" w:w="120"/>
-              <w:bottom w:type="dxa" w:w="90"/>
-              <w:right w:type="dxa" w:w="120"/>
-            </w:tcMar>
-          </w:tcPr>
-          <w:p>
-            <w:r>
-              <w:rPr>
-                <w:color w:val="767171"/>
-                <w:sz w:val="19"/>
-                <w:szCs w:val="19"/>
-              </w:rPr>
-              <w:t xml:space="preserve"> </w:t>
-            </w:r>
-          </w:p>
-        </w:tc>
-        <w:tc>
-          <w:tcPr>
-            <w:tcW w:type="dxa" w:w="1560"/>
             <w:tcMar>
               <w:top w:type="dxa" w:w="90"/>
               <w:left w:type="dxa" w:w="120"/>
@@ -3983,7 +3873,7 @@
           <w:sz w:val="22"/>
           <w:szCs w:val="22"/>
         </w:rPr>
-        <w:t xml:space="preserve">Which method wins, and does the ranking survive? Rank the methods at 250, 2,500 and 10,000 points, with your numbers. (2 points)</w:t>
+        <w:t xml:space="preserve">Which method wins, and does the ranking survive? Rank the methods at 250, 2,500 and 10,000 points, with your numbers. (3 points)</w:t>
       </w:r>
     </w:p>
     <w:p>
@@ -4013,37 +3903,7 @@
           <w:sz w:val="22"/>
           <w:szCs w:val="22"/>
         </w:rPr>
-        <w:t xml:space="preserve">Which parameter mattered, and which barely did? Compare the IDW powers (1, 2, 3 and yours) and the semivariogram model with the number of points. (2 points)</w:t>
-      </w:r>
-    </w:p>
-    <w:p>
-      <w:pPr>
-        <w:spacing w:after="260" w:before="0"/>
-      </w:pPr>
-      <w:r>
-        <w:rPr>
-          <w:i/>
-          <w:iCs/>
-          <w:color w:val="767171"/>
-          <w:highlight w:val="yellow"/>
-        </w:rPr>
-        <w:t xml:space="preserve">[Your answer here.]</w:t>
-      </w:r>
-    </w:p>
-    <w:p>
-      <w:pPr>
-        <w:pStyle w:val="Heading2"/>
-        <w:spacing w:after="60" w:before="220"/>
-      </w:pPr>
-      <w:r>
-        <w:rPr>
-          <w:b/>
-          <w:bCs/>
-          <w:color w:val="1F3864"/>
-          <w:sz w:val="22"/>
-          <w:szCs w:val="22"/>
-        </w:rPr>
-        <w:t xml:space="preserve">Could you have known without the truth? Compare each checkpoint RMSE with the RMSE over all 67,337 cells. (2 points)</w:t>
+        <w:t xml:space="preserve">Which parameter mattered, and which barely did? Compare the IDW powers (1, 2, 3 and yours) and the semivariogram model with the number of points. (3 points)</w:t>
       </w:r>
     </w:p>
     <w:p>
@@ -5219,7 +5079,7 @@
                 <w:sz w:val="17"/>
                 <w:szCs w:val="17"/>
               </w:rPr>
-              <w:t xml:space="preserve">One table with your baseline and the five Step 8 runs — including run 5 at your own IDW power, with your BYU ID's last two digits — the RMSE of all three methods in every row, and a row with your baseline's three checkpoint RMSEs (4)</w:t>
+              <w:t xml:space="preserve">One table with your baseline and the five Step 8 runs — including run 5 at your own IDW power, with your BYU ID's last two digits — the RMSE of all three methods in every row (4)</w:t>
             </w:r>
           </w:p>
           <w:p>
@@ -5236,7 +5096,7 @@
                 <w:sz w:val="17"/>
                 <w:szCs w:val="17"/>
               </w:rPr>
-              <w:t xml:space="preserve">Which method wins and whether the ranking survives, with your numbers (2)</w:t>
+              <w:t xml:space="preserve">Which method wins and whether the ranking survives, with your numbers (3)</w:t>
             </w:r>
           </w:p>
           <w:p>
@@ -5253,24 +5113,7 @@
                 <w:sz w:val="17"/>
                 <w:szCs w:val="17"/>
               </w:rPr>
-              <w:t xml:space="preserve">Which parameter mattered and which barely did, with your numbers (2)</w:t>
-            </w:r>
-          </w:p>
-          <w:p>
-            <w:pPr>
-              <w:pStyle w:val="ListParagraph"/>
-              <w:numPr>
-                <w:ilvl w:val="0"/>
-                <w:numId w:val="3"/>
-              </w:numPr>
-              <w:spacing w:after="40"/>
-            </w:pPr>
-            <w:r>
-              <w:rPr>
-                <w:sz w:val="17"/>
-                <w:szCs w:val="17"/>
-              </w:rPr>
-              <w:t xml:space="preserve">What the checkpoints would and would not have told you (2)</w:t>
+              <w:t xml:space="preserve">Which parameter mattered and which barely did, with your numbers (3)</w:t>
             </w:r>
           </w:p>
         </w:tc>

</xml_diff>